<commit_message>
Atualizações finais relatórios e ata
</commit_message>
<xml_diff>
--- a/backend/docs/template-ata-conselhofinal.docx
+++ b/backend/docs/template-ata-conselhofinal.docx
@@ -342,6 +342,14 @@
               </w:rPr>
               <w:t>{semestre}</w:t>
             </w:r>
+            <w:r>
+              <w:rPr>
+                <w:color w:val="595959"/>
+                <w:sz w:val="18"/>
+                <w:szCs w:val="18"/>
+              </w:rPr>
+              <w:t>/{ano}</w:t>
+            </w:r>
           </w:p>
         </w:tc>
         <w:tc>
@@ -403,25 +411,7 @@
                 <w:sz w:val="18"/>
                 <w:szCs w:val="18"/>
               </w:rPr>
-              <w:t>{</w:t>
-            </w:r>
-            <w:proofErr w:type="spellStart"/>
-            <w:r>
-              <w:rPr>
-                <w:color w:val="595959"/>
-                <w:sz w:val="18"/>
-                <w:szCs w:val="18"/>
-              </w:rPr>
-              <w:t>dataConselho</w:t>
-            </w:r>
-            <w:proofErr w:type="spellEnd"/>
-            <w:r>
-              <w:rPr>
-                <w:color w:val="595959"/>
-                <w:sz w:val="18"/>
-                <w:szCs w:val="18"/>
-              </w:rPr>
-              <w:t>}</w:t>
+              <w:t>{dataConselho}</w:t>
             </w:r>
           </w:p>
         </w:tc>
@@ -699,15 +689,15 @@
               </w:rPr>
             </w:pPr>
             <w:r>
-              <w:t>{</w:t>
-            </w:r>
-            <w:proofErr w:type="spellStart"/>
-            <w:r>
-              <w:t>codigoTurma</w:t>
-            </w:r>
-            <w:proofErr w:type="spellEnd"/>
-            <w:r>
-              <w:t>}</w:t>
+              <w:rPr>
+                <w:color w:val="000000"/>
+                <w:sz w:val="18"/>
+                <w:szCs w:val="18"/>
+              </w:rPr>
+              <w:t>{#alunos}{</w:t>
+            </w:r>
+            <w:r>
+              <w:t>codigoTurma}</w:t>
             </w:r>
             <w:r>
               <w:fldChar w:fldCharType="begin"/>
@@ -766,18 +756,8 @@
                 <w:sz w:val="18"/>
                 <w:szCs w:val="18"/>
               </w:rPr>
-              <w:t>{#</w:t>
-            </w:r>
-            <w:proofErr w:type="gramStart"/>
-            <w:r>
-              <w:rPr>
-                <w:color w:val="000000"/>
-                <w:sz w:val="18"/>
-                <w:szCs w:val="18"/>
-              </w:rPr>
-              <w:t>alunos}{</w:t>
-            </w:r>
-            <w:proofErr w:type="gramEnd"/>
+              <w:t>{</w:t>
+            </w:r>
             <w:r>
               <w:rPr>
                 <w:color w:val="000000"/>
@@ -1104,25 +1084,7 @@
                 <w:sz w:val="18"/>
                 <w:szCs w:val="18"/>
               </w:rPr>
-              <w:t>{</w:t>
-            </w:r>
-            <w:proofErr w:type="spellStart"/>
-            <w:r>
-              <w:rPr>
-                <w:color w:val="000000"/>
-                <w:sz w:val="18"/>
-                <w:szCs w:val="18"/>
-              </w:rPr>
-              <w:t>situacao</w:t>
-            </w:r>
-            <w:proofErr w:type="spellEnd"/>
-            <w:r>
-              <w:rPr>
-                <w:color w:val="000000"/>
-                <w:sz w:val="18"/>
-                <w:szCs w:val="18"/>
-              </w:rPr>
-              <w:t>}</w:t>
+              <w:t>{situacao}</w:t>
             </w:r>
           </w:p>
         </w:tc>
@@ -1347,25 +1309,7 @@
                 <w:sz w:val="18"/>
                 <w:szCs w:val="18"/>
               </w:rPr>
-              <w:t>{</w:t>
-            </w:r>
-            <w:proofErr w:type="spellStart"/>
-            <w:r>
-              <w:rPr>
-                <w:color w:val="000000"/>
-                <w:sz w:val="18"/>
-                <w:szCs w:val="18"/>
-              </w:rPr>
-              <w:t>contestacao</w:t>
-            </w:r>
-            <w:proofErr w:type="spellEnd"/>
-            <w:r>
-              <w:rPr>
-                <w:color w:val="000000"/>
-                <w:sz w:val="18"/>
-                <w:szCs w:val="18"/>
-              </w:rPr>
-              <w:t>}{/alunos}</w:t>
+              <w:t>{contestacao}{/alunos}</w:t>
             </w:r>
             <w:r>
               <w:fldChar w:fldCharType="begin"/>
@@ -1422,16 +1366,7 @@
           <w:top w:val="single" w:sz="6" w:space="23" w:color="D9D9D9"/>
         </w:pBdr>
         <w:spacing w:before="80"/>
-        <w:rPr>
-          <w:color w:val="595959"/>
-          <w:sz w:val="16"/>
-          <w:szCs w:val="16"/>
-          <w:u w:val="single"/>
-        </w:rPr>
       </w:pPr>
-      <w:r>
-        <w:t>{/turma}</w:t>
-      </w:r>
     </w:p>
     <w:p>
       <w:pPr>
@@ -1440,34 +1375,33 @@
         </w:pBdr>
         <w:spacing w:before="80"/>
         <w:rPr>
-          <w:u w:val="single"/>
-        </w:rPr>
-      </w:pPr>
-      <w:r>
-        <w:rPr>
           <w:color w:val="595959"/>
           <w:sz w:val="16"/>
           <w:szCs w:val="16"/>
-        </w:rPr>
-        <w:t xml:space="preserve">SENAI – Serviço Nacional de Aprendizagem </w:t>
-      </w:r>
-      <w:proofErr w:type="gramStart"/>
+          <w:u w:val="single"/>
+        </w:rPr>
+      </w:pPr>
+      <w:r>
+        <w:t>{/turma}</w:t>
+      </w:r>
+    </w:p>
+    <w:p>
+      <w:pPr>
+        <w:pBdr>
+          <w:top w:val="single" w:sz="6" w:space="23" w:color="D9D9D9"/>
+        </w:pBdr>
+        <w:spacing w:before="80"/>
+        <w:rPr>
+          <w:u w:val="single"/>
+        </w:rPr>
+      </w:pPr>
       <w:r>
         <w:rPr>
           <w:color w:val="595959"/>
           <w:sz w:val="16"/>
           <w:szCs w:val="16"/>
         </w:rPr>
-        <w:t>Industrial  |</w:t>
-      </w:r>
-      <w:proofErr w:type="gramEnd"/>
-      <w:r>
-        <w:rPr>
-          <w:color w:val="595959"/>
-          <w:sz w:val="16"/>
-          <w:szCs w:val="16"/>
-        </w:rPr>
-        <w:t xml:space="preserve">  </w:t>
+        <w:t xml:space="preserve">SENAI – Serviço Nacional de Aprendizagem Industrial  |  </w:t>
       </w:r>
       <w:r>
         <w:rPr>
@@ -1477,18 +1411,7 @@
           <w:sz w:val="16"/>
           <w:szCs w:val="16"/>
         </w:rPr>
-        <w:t>Escola "Mariano Ferraz</w:t>
-      </w:r>
-      <w:proofErr w:type="gramStart"/>
-      <w:r>
-        <w:rPr>
-          <w:b/>
-          <w:bCs/>
-          <w:color w:val="CC0000"/>
-          <w:sz w:val="16"/>
-          <w:szCs w:val="16"/>
-        </w:rPr>
-        <w:t>"</w:t>
+        <w:t>Escola "Mariano Ferraz"</w:t>
       </w:r>
       <w:r>
         <w:rPr>
@@ -1496,16 +1419,7 @@
           <w:sz w:val="16"/>
           <w:szCs w:val="16"/>
         </w:rPr>
-        <w:t xml:space="preserve">  |</w:t>
-      </w:r>
-      <w:proofErr w:type="gramEnd"/>
-      <w:r>
-        <w:rPr>
-          <w:color w:val="595959"/>
-          <w:sz w:val="16"/>
-          <w:szCs w:val="16"/>
-        </w:rPr>
-        <w:t xml:space="preserve">  </w:t>
+        <w:t xml:space="preserve">  |  </w:t>
       </w:r>
       <w:r>
         <w:rPr>

</xml_diff>

<commit_message>
Mudanças nos relatórios pedidos pelos AQV e apagando templates sem uso
</commit_message>
<xml_diff>
--- a/backend/docs/template-ata-conselhofinal.docx
+++ b/backend/docs/template-ata-conselhofinal.docx
@@ -411,7 +411,25 @@
                 <w:sz w:val="18"/>
                 <w:szCs w:val="18"/>
               </w:rPr>
-              <w:t>{dataConselho}</w:t>
+              <w:t>{</w:t>
+            </w:r>
+            <w:proofErr w:type="spellStart"/>
+            <w:r>
+              <w:rPr>
+                <w:color w:val="595959"/>
+                <w:sz w:val="18"/>
+                <w:szCs w:val="18"/>
+              </w:rPr>
+              <w:t>dataConselho</w:t>
+            </w:r>
+            <w:proofErr w:type="spellEnd"/>
+            <w:r>
+              <w:rPr>
+                <w:color w:val="595959"/>
+                <w:sz w:val="18"/>
+                <w:szCs w:val="18"/>
+              </w:rPr>
+              <w:t>}</w:t>
             </w:r>
           </w:p>
         </w:tc>
@@ -489,6 +507,7 @@
           <w:color w:val="000000" w:themeColor="text1"/>
           <w:sz w:val="22"/>
           <w:szCs w:val="22"/>
+          <w:u w:val="single"/>
           <w:lang w:eastAsia="en-US"/>
         </w:rPr>
       </w:pPr>
@@ -661,6 +680,16 @@
               </w:rPr>
               <w:t>Contestação</w:t>
             </w:r>
+            <w:r>
+              <w:rPr>
+                <w:b/>
+                <w:bCs/>
+                <w:color w:val="FFFFFF"/>
+                <w:sz w:val="18"/>
+                <w:szCs w:val="18"/>
+              </w:rPr>
+              <w:t>/Justificativa</w:t>
+            </w:r>
           </w:p>
         </w:tc>
       </w:tr>
@@ -694,8 +723,18 @@
                 <w:sz w:val="18"/>
                 <w:szCs w:val="18"/>
               </w:rPr>
-              <w:t>{#alunos}{</w:t>
-            </w:r>
+              <w:t>{#</w:t>
+            </w:r>
+            <w:proofErr w:type="gramStart"/>
+            <w:r>
+              <w:rPr>
+                <w:color w:val="000000"/>
+                <w:sz w:val="18"/>
+                <w:szCs w:val="18"/>
+              </w:rPr>
+              <w:t>alunos}{</w:t>
+            </w:r>
+            <w:proofErr w:type="gramEnd"/>
             <w:r>
               <w:t>codigoTurma}</w:t>
             </w:r>
@@ -758,13 +797,23 @@
               </w:rPr>
               <w:t>{</w:t>
             </w:r>
-            <w:r>
-              <w:rPr>
-                <w:color w:val="000000"/>
-                <w:sz w:val="18"/>
-                <w:szCs w:val="18"/>
-              </w:rPr>
-              <w:t>nomeAluno}</w:t>
+            <w:proofErr w:type="spellStart"/>
+            <w:r>
+              <w:rPr>
+                <w:color w:val="000000"/>
+                <w:sz w:val="18"/>
+                <w:szCs w:val="18"/>
+              </w:rPr>
+              <w:t>nomeAluno</w:t>
+            </w:r>
+            <w:proofErr w:type="spellEnd"/>
+            <w:r>
+              <w:rPr>
+                <w:color w:val="000000"/>
+                <w:sz w:val="18"/>
+                <w:szCs w:val="18"/>
+              </w:rPr>
+              <w:t>}</w:t>
             </w:r>
             <w:r>
               <w:rPr>
@@ -1084,7 +1133,25 @@
                 <w:sz w:val="18"/>
                 <w:szCs w:val="18"/>
               </w:rPr>
-              <w:t>{situacao}</w:t>
+              <w:t>{</w:t>
+            </w:r>
+            <w:proofErr w:type="spellStart"/>
+            <w:r>
+              <w:rPr>
+                <w:color w:val="000000"/>
+                <w:sz w:val="18"/>
+                <w:szCs w:val="18"/>
+              </w:rPr>
+              <w:t>situacao</w:t>
+            </w:r>
+            <w:proofErr w:type="spellEnd"/>
+            <w:r>
+              <w:rPr>
+                <w:color w:val="000000"/>
+                <w:sz w:val="18"/>
+                <w:szCs w:val="18"/>
+              </w:rPr>
+              <w:t>}</w:t>
             </w:r>
           </w:p>
         </w:tc>
@@ -1309,7 +1376,25 @@
                 <w:sz w:val="18"/>
                 <w:szCs w:val="18"/>
               </w:rPr>
-              <w:t>{contestacao}{/alunos}</w:t>
+              <w:t>{</w:t>
+            </w:r>
+            <w:proofErr w:type="spellStart"/>
+            <w:r>
+              <w:rPr>
+                <w:color w:val="000000"/>
+                <w:sz w:val="18"/>
+                <w:szCs w:val="18"/>
+              </w:rPr>
+              <w:t>contestacao</w:t>
+            </w:r>
+            <w:proofErr w:type="spellEnd"/>
+            <w:r>
+              <w:rPr>
+                <w:color w:val="000000"/>
+                <w:sz w:val="18"/>
+                <w:szCs w:val="18"/>
+              </w:rPr>
+              <w:t>}{/alunos}</w:t>
             </w:r>
             <w:r>
               <w:fldChar w:fldCharType="begin"/>
@@ -1401,7 +1486,25 @@
           <w:sz w:val="16"/>
           <w:szCs w:val="16"/>
         </w:rPr>
-        <w:t xml:space="preserve">SENAI – Serviço Nacional de Aprendizagem Industrial  |  </w:t>
+        <w:t xml:space="preserve">SENAI – Serviço Nacional de Aprendizagem </w:t>
+      </w:r>
+      <w:proofErr w:type="gramStart"/>
+      <w:r>
+        <w:rPr>
+          <w:color w:val="595959"/>
+          <w:sz w:val="16"/>
+          <w:szCs w:val="16"/>
+        </w:rPr>
+        <w:t>Industrial  |</w:t>
+      </w:r>
+      <w:proofErr w:type="gramEnd"/>
+      <w:r>
+        <w:rPr>
+          <w:color w:val="595959"/>
+          <w:sz w:val="16"/>
+          <w:szCs w:val="16"/>
+        </w:rPr>
+        <w:t xml:space="preserve">  </w:t>
       </w:r>
       <w:r>
         <w:rPr>
@@ -1411,7 +1514,18 @@
           <w:sz w:val="16"/>
           <w:szCs w:val="16"/>
         </w:rPr>
-        <w:t>Escola "Mariano Ferraz"</w:t>
+        <w:t>Escola "Mariano Ferraz</w:t>
+      </w:r>
+      <w:proofErr w:type="gramStart"/>
+      <w:r>
+        <w:rPr>
+          <w:b/>
+          <w:bCs/>
+          <w:color w:val="CC0000"/>
+          <w:sz w:val="16"/>
+          <w:szCs w:val="16"/>
+        </w:rPr>
+        <w:t>"</w:t>
       </w:r>
       <w:r>
         <w:rPr>
@@ -1419,7 +1533,16 @@
           <w:sz w:val="16"/>
           <w:szCs w:val="16"/>
         </w:rPr>
-        <w:t xml:space="preserve">  |  </w:t>
+        <w:t xml:space="preserve">  |</w:t>
+      </w:r>
+      <w:proofErr w:type="gramEnd"/>
+      <w:r>
+        <w:rPr>
+          <w:color w:val="595959"/>
+          <w:sz w:val="16"/>
+          <w:szCs w:val="16"/>
+        </w:rPr>
+        <w:t xml:space="preserve">  </w:t>
       </w:r>
       <w:r>
         <w:rPr>
@@ -1440,6 +1563,7 @@
       </w:r>
     </w:p>
     <w:sectPr>
+      <w:headerReference w:type="default" r:id="rId7"/>
       <w:pgSz w:w="16838" w:h="11906" w:orient="landscape"/>
       <w:pgMar w:top="1080" w:right="1080" w:bottom="1080" w:left="1080" w:header="708" w:footer="708" w:gutter="0"/>
       <w:pgNumType w:start="1"/>
@@ -1447,6 +1571,108 @@
     </w:sectPr>
   </w:body>
 </w:document>
+</file>
+
+<file path=word/endnotes.xml><?xml version="1.0" encoding="utf-8"?>
+<w:endnotes xmlns:wpc="http://schemas.microsoft.com/office/word/2010/wordprocessingCanvas" xmlns:cx="http://schemas.microsoft.com/office/drawing/2014/chartex" xmlns:cx1="http://schemas.microsoft.com/office/drawing/2015/9/8/chartex" xmlns:cx2="http://schemas.microsoft.com/office/drawing/2015/10/21/chartex" xmlns:cx3="http://schemas.microsoft.com/office/drawing/2016/5/9/chartex" xmlns:cx4="http://schemas.microsoft.com/office/drawing/2016/5/10/chartex" xmlns:cx5="http://schemas.microsoft.com/office/drawing/2016/5/11/chartex" xmlns:cx6="http://schemas.microsoft.com/office/drawing/2016/5/12/chartex" xmlns:cx7="http://schemas.microsoft.com/office/drawing/2016/5/13/chartex" xmlns:cx8="http://schemas.microsoft.com/office/drawing/2016/5/14/chartex" xmlns:mc="http://schemas.openxmlformats.org/markup-compatibility/2006" xmlns:aink="http://schemas.microsoft.com/office/drawing/2016/ink" xmlns:am3d="http://schemas.microsoft.com/office/drawing/2017/model3d" xmlns:o="urn:schemas-microsoft-com:office:office" xmlns:oel="http://schemas.microsoft.com/office/2019/extlst" xmlns:r="http://schemas.openxmlformats.org/officeDocument/2006/relationships" xmlns:m="http://schemas.openxmlformats.org/officeDocument/2006/math" xmlns:v="urn:schemas-microsoft-com:vml" xmlns:wp14="http://schemas.microsoft.com/office/word/2010/wordprocessingDrawing" xmlns:wp="http://schemas.openxmlformats.org/drawingml/2006/wordprocessingDrawing" xmlns:w10="urn:schemas-microsoft-com:office:word" xmlns:w="http://schemas.openxmlformats.org/wordprocessingml/2006/main" xmlns:w14="http://schemas.microsoft.com/office/word/2010/wordml" xmlns:w15="http://schemas.microsoft.com/office/word/2012/wordml" xmlns:w16cex="http://schemas.microsoft.com/office/word/2018/wordml/cex" xmlns:w16cid="http://schemas.microsoft.com/office/word/2016/wordml/cid" xmlns:w16="http://schemas.microsoft.com/office/word/2018/wordml" xmlns:w16du="http://schemas.microsoft.com/office/word/2023/wordml/word16du" xmlns:w16sdtdh="http://schemas.microsoft.com/office/word/2020/wordml/sdtdatahash" xmlns:w16sdtfl="http://schemas.microsoft.com/office/word/2024/wordml/sdtformatlock" xmlns:w16se="http://schemas.microsoft.com/office/word/2015/wordml/symex" xmlns:wpg="http://schemas.microsoft.com/office/word/2010/wordprocessingGroup" xmlns:wpi="http://schemas.microsoft.com/office/word/2010/wordprocessingInk" xmlns:wne="http://schemas.microsoft.com/office/word/2006/wordml" xmlns:wps="http://schemas.microsoft.com/office/word/2010/wordprocessingShape" mc:Ignorable="w14 w15 w16se w16cid w16 w16cex w16sdtdh w16sdtfl w16du wp14">
+  <w:endnote w:type="separator" w:id="-1">
+    <w:p>
+      <w:r>
+        <w:separator/>
+      </w:r>
+    </w:p>
+  </w:endnote>
+  <w:endnote w:type="continuationSeparator" w:id="0">
+    <w:p>
+      <w:r>
+        <w:continuationSeparator/>
+      </w:r>
+    </w:p>
+  </w:endnote>
+</w:endnotes>
+</file>
+
+<file path=word/footnotes.xml><?xml version="1.0" encoding="utf-8"?>
+<w:footnotes xmlns:wpc="http://schemas.microsoft.com/office/word/2010/wordprocessingCanvas" xmlns:cx="http://schemas.microsoft.com/office/drawing/2014/chartex" xmlns:cx1="http://schemas.microsoft.com/office/drawing/2015/9/8/chartex" xmlns:cx2="http://schemas.microsoft.com/office/drawing/2015/10/21/chartex" xmlns:cx3="http://schemas.microsoft.com/office/drawing/2016/5/9/chartex" xmlns:cx4="http://schemas.microsoft.com/office/drawing/2016/5/10/chartex" xmlns:cx5="http://schemas.microsoft.com/office/drawing/2016/5/11/chartex" xmlns:cx6="http://schemas.microsoft.com/office/drawing/2016/5/12/chartex" xmlns:cx7="http://schemas.microsoft.com/office/drawing/2016/5/13/chartex" xmlns:cx8="http://schemas.microsoft.com/office/drawing/2016/5/14/chartex" xmlns:mc="http://schemas.openxmlformats.org/markup-compatibility/2006" xmlns:aink="http://schemas.microsoft.com/office/drawing/2016/ink" xmlns:am3d="http://schemas.microsoft.com/office/drawing/2017/model3d" xmlns:o="urn:schemas-microsoft-com:office:office" xmlns:oel="http://schemas.microsoft.com/office/2019/extlst" xmlns:r="http://schemas.openxmlformats.org/officeDocument/2006/relationships" xmlns:m="http://schemas.openxmlformats.org/officeDocument/2006/math" xmlns:v="urn:schemas-microsoft-com:vml" xmlns:wp14="http://schemas.microsoft.com/office/word/2010/wordprocessingDrawing" xmlns:wp="http://schemas.openxmlformats.org/drawingml/2006/wordprocessingDrawing" xmlns:w10="urn:schemas-microsoft-com:office:word" xmlns:w="http://schemas.openxmlformats.org/wordprocessingml/2006/main" xmlns:w14="http://schemas.microsoft.com/office/word/2010/wordml" xmlns:w15="http://schemas.microsoft.com/office/word/2012/wordml" xmlns:w16cex="http://schemas.microsoft.com/office/word/2018/wordml/cex" xmlns:w16cid="http://schemas.microsoft.com/office/word/2016/wordml/cid" xmlns:w16="http://schemas.microsoft.com/office/word/2018/wordml" xmlns:w16du="http://schemas.microsoft.com/office/word/2023/wordml/word16du" xmlns:w16sdtdh="http://schemas.microsoft.com/office/word/2020/wordml/sdtdatahash" xmlns:w16sdtfl="http://schemas.microsoft.com/office/word/2024/wordml/sdtformatlock" xmlns:w16se="http://schemas.microsoft.com/office/word/2015/wordml/symex" xmlns:wpg="http://schemas.microsoft.com/office/word/2010/wordprocessingGroup" xmlns:wpi="http://schemas.microsoft.com/office/word/2010/wordprocessingInk" xmlns:wne="http://schemas.microsoft.com/office/word/2006/wordml" xmlns:wps="http://schemas.microsoft.com/office/word/2010/wordprocessingShape" mc:Ignorable="w14 w15 w16se w16cid w16 w16cex w16sdtdh w16sdtfl w16du wp14">
+  <w:footnote w:type="separator" w:id="-1">
+    <w:p>
+      <w:r>
+        <w:separator/>
+      </w:r>
+    </w:p>
+  </w:footnote>
+  <w:footnote w:type="continuationSeparator" w:id="0">
+    <w:p>
+      <w:r>
+        <w:continuationSeparator/>
+      </w:r>
+    </w:p>
+  </w:footnote>
+</w:footnotes>
+</file>
+
+<file path=word/header1.xml><?xml version="1.0" encoding="utf-8"?>
+<w:hdr xmlns:wpc="http://schemas.microsoft.com/office/word/2010/wordprocessingCanvas" xmlns:cx="http://schemas.microsoft.com/office/drawing/2014/chartex" xmlns:cx1="http://schemas.microsoft.com/office/drawing/2015/9/8/chartex" xmlns:cx2="http://schemas.microsoft.com/office/drawing/2015/10/21/chartex" xmlns:cx3="http://schemas.microsoft.com/office/drawing/2016/5/9/chartex" xmlns:cx4="http://schemas.microsoft.com/office/drawing/2016/5/10/chartex" xmlns:cx5="http://schemas.microsoft.com/office/drawing/2016/5/11/chartex" xmlns:cx6="http://schemas.microsoft.com/office/drawing/2016/5/12/chartex" xmlns:cx7="http://schemas.microsoft.com/office/drawing/2016/5/13/chartex" xmlns:cx8="http://schemas.microsoft.com/office/drawing/2016/5/14/chartex" xmlns:mc="http://schemas.openxmlformats.org/markup-compatibility/2006" xmlns:aink="http://schemas.microsoft.com/office/drawing/2016/ink" xmlns:am3d="http://schemas.microsoft.com/office/drawing/2017/model3d" xmlns:o="urn:schemas-microsoft-com:office:office" xmlns:oel="http://schemas.microsoft.com/office/2019/extlst" xmlns:r="http://schemas.openxmlformats.org/officeDocument/2006/relationships" xmlns:m="http://schemas.openxmlformats.org/officeDocument/2006/math" xmlns:v="urn:schemas-microsoft-com:vml" xmlns:wp14="http://schemas.microsoft.com/office/word/2010/wordprocessingDrawing" xmlns:wp="http://schemas.openxmlformats.org/drawingml/2006/wordprocessingDrawing" xmlns:w10="urn:schemas-microsoft-com:office:word" xmlns:w="http://schemas.openxmlformats.org/wordprocessingml/2006/main" xmlns:w14="http://schemas.microsoft.com/office/word/2010/wordml" xmlns:w15="http://schemas.microsoft.com/office/word/2012/wordml" xmlns:w16cex="http://schemas.microsoft.com/office/word/2018/wordml/cex" xmlns:w16cid="http://schemas.microsoft.com/office/word/2016/wordml/cid" xmlns:w16="http://schemas.microsoft.com/office/word/2018/wordml" xmlns:w16du="http://schemas.microsoft.com/office/word/2023/wordml/word16du" xmlns:w16sdtdh="http://schemas.microsoft.com/office/word/2020/wordml/sdtdatahash" xmlns:w16sdtfl="http://schemas.microsoft.com/office/word/2024/wordml/sdtformatlock" xmlns:w16se="http://schemas.microsoft.com/office/word/2015/wordml/symex" xmlns:wpg="http://schemas.microsoft.com/office/word/2010/wordprocessingGroup" xmlns:wpi="http://schemas.microsoft.com/office/word/2010/wordprocessingInk" xmlns:wne="http://schemas.microsoft.com/office/word/2006/wordml" xmlns:wps="http://schemas.microsoft.com/office/word/2010/wordprocessingShape" mc:Ignorable="w14 w15 w16se w16cid w16 w16cex w16sdtdh w16sdtfl w16du wp14">
+  <w:p>
+    <w:pPr>
+      <w:pStyle w:val="Cabealho"/>
+      <w:jc w:val="center"/>
+    </w:pPr>
+    <w:r>
+      <w:rPr>
+        <w:noProof/>
+      </w:rPr>
+      <w:drawing>
+        <wp:inline distT="0" distB="0" distL="0" distR="0" wp14:anchorId="61674A07" wp14:editId="60BBBFBB">
+          <wp:extent cx="1952625" cy="500594"/>
+          <wp:effectExtent l="0" t="0" r="0" b="0"/>
+          <wp:docPr id="125558523" name="Imagem 1"/>
+          <wp:cNvGraphicFramePr>
+            <a:graphicFrameLocks xmlns:a="http://schemas.openxmlformats.org/drawingml/2006/main" noChangeAspect="1"/>
+          </wp:cNvGraphicFramePr>
+          <a:graphic xmlns:a="http://schemas.openxmlformats.org/drawingml/2006/main">
+            <a:graphicData uri="http://schemas.openxmlformats.org/drawingml/2006/picture">
+              <pic:pic xmlns:pic="http://schemas.openxmlformats.org/drawingml/2006/picture">
+                <pic:nvPicPr>
+                  <pic:cNvPr id="0" name="Picture 1"/>
+                  <pic:cNvPicPr>
+                    <a:picLocks noChangeAspect="1" noChangeArrowheads="1"/>
+                  </pic:cNvPicPr>
+                </pic:nvPicPr>
+                <pic:blipFill>
+                  <a:blip r:embed="rId1">
+                    <a:extLst>
+                      <a:ext uri="{28A0092B-C50C-407E-A947-70E740481C1C}">
+                        <a14:useLocalDpi xmlns:a14="http://schemas.microsoft.com/office/drawing/2010/main" val="0"/>
+                      </a:ext>
+                    </a:extLst>
+                  </a:blip>
+                  <a:srcRect/>
+                  <a:stretch>
+                    <a:fillRect/>
+                  </a:stretch>
+                </pic:blipFill>
+                <pic:spPr bwMode="auto">
+                  <a:xfrm>
+                    <a:off x="0" y="0"/>
+                    <a:ext cx="1988928" cy="509901"/>
+                  </a:xfrm>
+                  <a:prstGeom prst="rect">
+                    <a:avLst/>
+                  </a:prstGeom>
+                  <a:noFill/>
+                  <a:ln>
+                    <a:noFill/>
+                  </a:ln>
+                </pic:spPr>
+              </pic:pic>
+            </a:graphicData>
+          </a:graphic>
+        </wp:inline>
+      </w:drawing>
+    </w:r>
+  </w:p>
+</w:hdr>
 </file>
 
 <file path=word/styles.xml><?xml version="1.0" encoding="utf-8"?>
@@ -2085,6 +2311,48 @@
       </w:tblCellMar>
     </w:tblPr>
   </w:style>
+  <w:style w:type="paragraph" w:styleId="Cabealho">
+    <w:name w:val="header"/>
+    <w:basedOn w:val="Normal"/>
+    <w:link w:val="CabealhoChar"/>
+    <w:uiPriority w:val="99"/>
+    <w:unhideWhenUsed/>
+    <w:rsid w:val="0073237C"/>
+    <w:pPr>
+      <w:tabs>
+        <w:tab w:val="center" w:pos="4252"/>
+        <w:tab w:val="right" w:pos="8504"/>
+      </w:tabs>
+    </w:pPr>
+  </w:style>
+  <w:style w:type="character" w:customStyle="1" w:styleId="CabealhoChar">
+    <w:name w:val="Cabeçalho Char"/>
+    <w:basedOn w:val="Fontepargpadro"/>
+    <w:link w:val="Cabealho"/>
+    <w:uiPriority w:val="99"/>
+    <w:rsid w:val="0073237C"/>
+  </w:style>
+  <w:style w:type="paragraph" w:styleId="Rodap">
+    <w:name w:val="footer"/>
+    <w:basedOn w:val="Normal"/>
+    <w:link w:val="RodapChar"/>
+    <w:uiPriority w:val="99"/>
+    <w:unhideWhenUsed/>
+    <w:rsid w:val="0073237C"/>
+    <w:pPr>
+      <w:tabs>
+        <w:tab w:val="center" w:pos="4252"/>
+        <w:tab w:val="right" w:pos="8504"/>
+      </w:tabs>
+    </w:pPr>
+  </w:style>
+  <w:style w:type="character" w:customStyle="1" w:styleId="RodapChar">
+    <w:name w:val="Rodapé Char"/>
+    <w:basedOn w:val="Fontepargpadro"/>
+    <w:link w:val="Rodap"/>
+    <w:uiPriority w:val="99"/>
+    <w:rsid w:val="0073237C"/>
+  </w:style>
 </w:styles>
 </file>
 

</xml_diff>